<commit_message>
Replace the r = -0.80 claim with decile-wise shift and ambiguity counts
- Results 3.5: decile gradient (Q1 0.125->0.566, +0.441; Q10 0.959->0.983,
  +0.024), images below 0.5 falling 43 -> 17 (10.3% -> 4.1%), the six
  confidence-missed HCC at cosine 0.26-0.55 (bottom 0-4 percentile) yet above
  every hemangioma (max 0.032), and the Delta-score caveat (16 -> 20 cases)
- Discussion: the gradient is what the SupCon objective and a compressive
  transform predict, so it is not independent evidence of clinical validity
- Supplementary S7 + Table S4: full decile table, threshold counts, and the
  class separation on the cosine score; headings keep with the next paragraph
- Response letter Comment 2 gains item 5; body length synced to 9,993
- final_files refreshed

Discord: https://discord.com/channels/1558830378104529049/1564511452818055292
</commit_message>
<xml_diff>
--- a/paper_submission/revision4/Response_to_Reviewers_v6.docx
+++ b/paper_submission/revision4/Response_to_Reviewers_v6.docx
@@ -325,6 +325,18 @@
           <w:sz w:val="20"/>
         </w:rPr>
         <w:t>③ 읽는 방식의 한계: 점수의 절대값은 의미가 없고 같은 모델 안에서의 상대 비교로만 읽어야 하며, 임계값과 등가 구간은 유도 코호트에 종속됩니다. SupCon 적용 시 두 클래스 간 간격이 오히려 좁아졌으므로 Δscore 해석에도 주의가 필요하고, 이 값들은 보정되지 않았습니다.</w:t>
+      </w:r>
+    </w:p>
+    <w:p>
+      <w:pPr>
+        <w:jc w:val="both"/>
+      </w:pPr>
+      <w:r>
+        <w:rPr>
+          <w:rFonts w:ascii="Batang" w:hAnsi="Batang"/>
+          <w:sz w:val="20"/>
+        </w:rPr>
+        <w:t>⑤ SupCon 전후 코사인 유사도 점수 변화는 상관계수 대신 십분위별 상승 폭과 점수 구간별 빈도로 제시하였습니다. 1분위는 +0.441, 10분위는 +0.024로 상승 폭이 단조 감소하였고, 점수 0.5 미만 영상은 43장(10.3%)에서 17장(4.1%)으로 줄었습니다. 저점수 증례에서 상승 폭이 큰 것은 SupCon 목적함수와 압축적 변환이 예측하는 방향이며, Δscore 개선은 관찰되지 않았다는 점을 함께 밝혔습니다(Supplementary S7, 표 S4).</w:t>
       </w:r>
     </w:p>
     <w:p>
@@ -870,7 +882,7 @@
           <w:rFonts w:ascii="Batang" w:hAnsi="Batang"/>
           <w:sz w:val="20"/>
         </w:rPr>
-        <w:t>표지 → 영문초록(243단어, MeSH 중심단어 6개) → 본문(서론·방법·결과·고찰·결론, 9,777자) → 국문요약(791자) 및 중심단어 → 참고문헌(18개) → 표(5개) → 그림 설명문(5개) → Supplementary Methods.</w:t>
+        <w:t>표지 → 영문초록(243단어, MeSH 중심단어 6개) → 본문(서론·방법·결과·고찰·결론, 9,993자) → 국문요약(791자) 및 중심단어 → 참고문헌(18개) → 표(5개) → 그림 설명문(5개) → Supplementary Methods.</w:t>
       </w:r>
     </w:p>
     <w:p>

</xml_diff>